<commit_message>
Instance Wizard management in progress...
</commit_message>
<xml_diff>
--- a/server/Bonus management description.docx
+++ b/server/Bonus management description.docx
@@ -9,6 +9,1768 @@
         <w:outlineLvl w:val="2"/>
         <w:rPr>
           <w:rFonts w:ascii="Segoe UI" w:eastAsia="Times New Roman" w:hAnsi="Segoe UI" w:cs="Segoe UI"/>
+          <w:b/>
+          <w:bCs/>
+          <w:color w:val="F8FAFF"/>
+          <w:kern w:val="0"/>
+          <w:sz w:val="27"/>
+          <w:szCs w:val="27"/>
+          <w:lang w:eastAsia="en-GB"/>
+          <w14:ligatures w14:val="none"/>
+        </w:rPr>
+      </w:pPr>
+    </w:p>
+    <w:p>
+      <w:pPr>
+        <w:shd w:val="clear" w:color="auto" w:fill="292A2D"/>
+        <w:spacing w:after="206" w:line="240" w:lineRule="auto"/>
+        <w:outlineLvl w:val="2"/>
+        <w:rPr>
+          <w:rFonts w:ascii="Segoe UI" w:eastAsia="Times New Roman" w:hAnsi="Segoe UI" w:cs="Segoe UI"/>
+          <w:b/>
+          <w:bCs/>
+          <w:color w:val="F8FAFF"/>
+          <w:kern w:val="0"/>
+          <w:sz w:val="27"/>
+          <w:szCs w:val="27"/>
+          <w:lang w:eastAsia="en-GB"/>
+          <w14:ligatures w14:val="none"/>
+        </w:rPr>
+      </w:pPr>
+    </w:p>
+    <w:p>
+      <w:pPr>
+        <w:shd w:val="clear" w:color="auto" w:fill="292A2D"/>
+        <w:spacing w:after="206" w:line="240" w:lineRule="auto"/>
+        <w:outlineLvl w:val="2"/>
+        <w:rPr>
+          <w:rFonts w:ascii="Segoe UI" w:eastAsia="Times New Roman" w:hAnsi="Segoe UI" w:cs="Segoe UI"/>
+          <w:b/>
+          <w:bCs/>
+          <w:color w:val="F8FAFF"/>
+          <w:kern w:val="0"/>
+          <w:sz w:val="27"/>
+          <w:szCs w:val="27"/>
+          <w:lang w:eastAsia="en-GB"/>
+          <w14:ligatures w14:val="none"/>
+        </w:rPr>
+      </w:pPr>
+      <w:r>
+        <w:rPr>
+          <w:rFonts w:ascii="Segoe UI" w:eastAsia="Times New Roman" w:hAnsi="Segoe UI" w:cs="Segoe UI"/>
+          <w:b/>
+          <w:bCs/>
+          <w:color w:val="F8FAFF"/>
+          <w:kern w:val="0"/>
+          <w:sz w:val="27"/>
+          <w:szCs w:val="27"/>
+          <w:lang w:eastAsia="en-GB"/>
+          <w14:ligatures w14:val="none"/>
+        </w:rPr>
+        <w:t>--------QUESTIONS----</w:t>
+      </w:r>
+    </w:p>
+    <w:p>
+      <w:pPr>
+        <w:shd w:val="clear" w:color="auto" w:fill="292A2D"/>
+        <w:spacing w:after="206" w:line="240" w:lineRule="auto"/>
+        <w:outlineLvl w:val="2"/>
+        <w:rPr>
+          <w:rFonts w:ascii="Segoe UI" w:eastAsia="Times New Roman" w:hAnsi="Segoe UI" w:cs="Segoe UI"/>
+          <w:b/>
+          <w:bCs/>
+          <w:color w:val="F8FAFF"/>
+          <w:kern w:val="0"/>
+          <w:sz w:val="27"/>
+          <w:szCs w:val="27"/>
+          <w:lang w:eastAsia="en-GB"/>
+          <w14:ligatures w14:val="none"/>
+        </w:rPr>
+      </w:pPr>
+      <w:r>
+        <w:rPr>
+          <w:rFonts w:ascii="Segoe UI" w:eastAsia="Times New Roman" w:hAnsi="Segoe UI" w:cs="Segoe UI"/>
+          <w:b/>
+          <w:bCs/>
+          <w:color w:val="F8FAFF"/>
+          <w:kern w:val="0"/>
+          <w:sz w:val="27"/>
+          <w:szCs w:val="27"/>
+          <w:lang w:eastAsia="en-GB"/>
+          <w14:ligatures w14:val="none"/>
+        </w:rPr>
+        <w:t>You</w:t>
+      </w:r>
+    </w:p>
+    <w:p>
+      <w:pPr>
+        <w:shd w:val="clear" w:color="auto" w:fill="292A2D"/>
+        <w:spacing w:after="206" w:line="240" w:lineRule="auto"/>
+        <w:outlineLvl w:val="2"/>
+        <w:rPr>
+          <w:rFonts w:ascii="Segoe UI" w:eastAsia="Times New Roman" w:hAnsi="Segoe UI" w:cs="Segoe UI"/>
+          <w:b/>
+          <w:bCs/>
+          <w:color w:val="F8FAFF"/>
+          <w:kern w:val="0"/>
+          <w:sz w:val="27"/>
+          <w:szCs w:val="27"/>
+          <w:lang w:eastAsia="en-GB"/>
+          <w14:ligatures w14:val="none"/>
+        </w:rPr>
+      </w:pPr>
+      <w:r>
+        <w:rPr>
+          <w:rFonts w:ascii="Segoe UI" w:eastAsia="Times New Roman" w:hAnsi="Segoe UI" w:cs="Segoe UI"/>
+          <w:b/>
+          <w:bCs/>
+          <w:color w:val="F8FAFF"/>
+          <w:kern w:val="0"/>
+          <w:sz w:val="27"/>
+          <w:szCs w:val="27"/>
+          <w:lang w:eastAsia="en-GB"/>
+          <w14:ligatures w14:val="none"/>
+        </w:rPr>
+        <w:t xml:space="preserve">Based on the code and your explanation, I understand that there's a relationship between </w:t>
+      </w:r>
+      <w:proofErr w:type="spellStart"/>
+      <w:r>
+        <w:rPr>
+          <w:rFonts w:ascii="Segoe UI" w:eastAsia="Times New Roman" w:hAnsi="Segoe UI" w:cs="Segoe UI"/>
+          <w:b/>
+          <w:bCs/>
+          <w:color w:val="F8FAFF"/>
+          <w:kern w:val="0"/>
+          <w:sz w:val="27"/>
+          <w:szCs w:val="27"/>
+          <w:lang w:eastAsia="en-GB"/>
+          <w14:ligatures w14:val="none"/>
+        </w:rPr>
+        <w:t>BonusInstance</w:t>
+      </w:r>
+      <w:proofErr w:type="spellEnd"/>
+      <w:r>
+        <w:rPr>
+          <w:rFonts w:ascii="Segoe UI" w:eastAsia="Times New Roman" w:hAnsi="Segoe UI" w:cs="Segoe UI"/>
+          <w:b/>
+          <w:bCs/>
+          <w:color w:val="F8FAFF"/>
+          <w:kern w:val="0"/>
+          <w:sz w:val="27"/>
+          <w:szCs w:val="27"/>
+          <w:lang w:eastAsia="en-GB"/>
+          <w14:ligatures w14:val="none"/>
+        </w:rPr>
+        <w:t xml:space="preserve">, </w:t>
+      </w:r>
+      <w:proofErr w:type="spellStart"/>
+      <w:r>
+        <w:rPr>
+          <w:rFonts w:ascii="Segoe UI" w:eastAsia="Times New Roman" w:hAnsi="Segoe UI" w:cs="Segoe UI"/>
+          <w:b/>
+          <w:bCs/>
+          <w:color w:val="F8FAFF"/>
+          <w:kern w:val="0"/>
+          <w:sz w:val="27"/>
+          <w:szCs w:val="27"/>
+          <w:lang w:eastAsia="en-GB"/>
+          <w14:ligatures w14:val="none"/>
+        </w:rPr>
+        <w:t>PersonnelSnapshot</w:t>
+      </w:r>
+      <w:proofErr w:type="spellEnd"/>
+      <w:r>
+        <w:rPr>
+          <w:rFonts w:ascii="Segoe UI" w:eastAsia="Times New Roman" w:hAnsi="Segoe UI" w:cs="Segoe UI"/>
+          <w:b/>
+          <w:bCs/>
+          <w:color w:val="F8FAFF"/>
+          <w:kern w:val="0"/>
+          <w:sz w:val="27"/>
+          <w:szCs w:val="27"/>
+          <w:lang w:eastAsia="en-GB"/>
+          <w14:ligatures w14:val="none"/>
+        </w:rPr>
+        <w:t xml:space="preserve">, and </w:t>
+      </w:r>
+      <w:proofErr w:type="spellStart"/>
+      <w:r>
+        <w:rPr>
+          <w:rFonts w:ascii="Segoe UI" w:eastAsia="Times New Roman" w:hAnsi="Segoe UI" w:cs="Segoe UI"/>
+          <w:b/>
+          <w:bCs/>
+          <w:color w:val="F8FAFF"/>
+          <w:kern w:val="0"/>
+          <w:sz w:val="27"/>
+          <w:szCs w:val="27"/>
+          <w:lang w:eastAsia="en-GB"/>
+          <w14:ligatures w14:val="none"/>
+        </w:rPr>
+        <w:t>BonusAllocation</w:t>
+      </w:r>
+      <w:proofErr w:type="spellEnd"/>
+      <w:r>
+        <w:rPr>
+          <w:rFonts w:ascii="Segoe UI" w:eastAsia="Times New Roman" w:hAnsi="Segoe UI" w:cs="Segoe UI"/>
+          <w:b/>
+          <w:bCs/>
+          <w:color w:val="F8FAFF"/>
+          <w:kern w:val="0"/>
+          <w:sz w:val="27"/>
+          <w:szCs w:val="27"/>
+          <w:lang w:eastAsia="en-GB"/>
+          <w14:ligatures w14:val="none"/>
+        </w:rPr>
+        <w:t>. Let me summarize my understanding and ask a few clarifying questions:</w:t>
+      </w:r>
+    </w:p>
+    <w:p>
+      <w:pPr>
+        <w:shd w:val="clear" w:color="auto" w:fill="292A2D"/>
+        <w:spacing w:after="206" w:line="240" w:lineRule="auto"/>
+        <w:outlineLvl w:val="2"/>
+        <w:rPr>
+          <w:rFonts w:ascii="Segoe UI" w:eastAsia="Times New Roman" w:hAnsi="Segoe UI" w:cs="Segoe UI"/>
+          <w:b/>
+          <w:bCs/>
+          <w:color w:val="F8FAFF"/>
+          <w:kern w:val="0"/>
+          <w:sz w:val="27"/>
+          <w:szCs w:val="27"/>
+          <w:lang w:eastAsia="en-GB"/>
+          <w14:ligatures w14:val="none"/>
+        </w:rPr>
+      </w:pPr>
+      <w:r>
+        <w:rPr>
+          <w:rFonts w:ascii="Segoe UI" w:eastAsia="Times New Roman" w:hAnsi="Segoe UI" w:cs="Segoe UI"/>
+          <w:b/>
+          <w:bCs/>
+          <w:color w:val="F8FAFF"/>
+          <w:kern w:val="0"/>
+          <w:sz w:val="27"/>
+          <w:szCs w:val="27"/>
+          <w:lang w:eastAsia="en-GB"/>
+          <w14:ligatures w14:val="none"/>
+        </w:rPr>
+        <w:t>My Understanding</w:t>
+      </w:r>
+    </w:p>
+    <w:p>
+      <w:pPr>
+        <w:shd w:val="clear" w:color="auto" w:fill="292A2D"/>
+        <w:spacing w:after="206" w:line="240" w:lineRule="auto"/>
+        <w:outlineLvl w:val="2"/>
+        <w:rPr>
+          <w:rFonts w:ascii="Segoe UI" w:eastAsia="Times New Roman" w:hAnsi="Segoe UI" w:cs="Segoe UI"/>
+          <w:b/>
+          <w:bCs/>
+          <w:color w:val="F8FAFF"/>
+          <w:kern w:val="0"/>
+          <w:sz w:val="27"/>
+          <w:szCs w:val="27"/>
+          <w:lang w:eastAsia="en-GB"/>
+          <w14:ligatures w14:val="none"/>
+        </w:rPr>
+      </w:pPr>
+      <w:proofErr w:type="spellStart"/>
+      <w:r>
+        <w:rPr>
+          <w:rFonts w:ascii="Segoe UI" w:eastAsia="Times New Roman" w:hAnsi="Segoe UI" w:cs="Segoe UI"/>
+          <w:b/>
+          <w:bCs/>
+          <w:color w:val="F8FAFF"/>
+          <w:kern w:val="0"/>
+          <w:sz w:val="27"/>
+          <w:szCs w:val="27"/>
+          <w:lang w:eastAsia="en-GB"/>
+          <w14:ligatures w14:val="none"/>
+        </w:rPr>
+        <w:t>BonusInstance</w:t>
+      </w:r>
+      <w:proofErr w:type="spellEnd"/>
+      <w:r>
+        <w:rPr>
+          <w:rFonts w:ascii="Segoe UI" w:eastAsia="Times New Roman" w:hAnsi="Segoe UI" w:cs="Segoe UI"/>
+          <w:b/>
+          <w:bCs/>
+          <w:color w:val="F8FAFF"/>
+          <w:kern w:val="0"/>
+          <w:sz w:val="27"/>
+          <w:szCs w:val="27"/>
+          <w:lang w:eastAsia="en-GB"/>
+          <w14:ligatures w14:val="none"/>
+        </w:rPr>
+        <w:t>: Represents a bonus payment period (e.g., quarterly bonus for Q1 2025)</w:t>
+      </w:r>
+    </w:p>
+    <w:p>
+      <w:pPr>
+        <w:shd w:val="clear" w:color="auto" w:fill="292A2D"/>
+        <w:spacing w:after="206" w:line="240" w:lineRule="auto"/>
+        <w:outlineLvl w:val="2"/>
+        <w:rPr>
+          <w:rFonts w:ascii="Segoe UI" w:eastAsia="Times New Roman" w:hAnsi="Segoe UI" w:cs="Segoe UI"/>
+          <w:b/>
+          <w:bCs/>
+          <w:color w:val="F8FAFF"/>
+          <w:kern w:val="0"/>
+          <w:sz w:val="27"/>
+          <w:szCs w:val="27"/>
+          <w:lang w:eastAsia="en-GB"/>
+          <w14:ligatures w14:val="none"/>
+        </w:rPr>
+      </w:pPr>
+      <w:r>
+        <w:rPr>
+          <w:rFonts w:ascii="Segoe UI" w:eastAsia="Times New Roman" w:hAnsi="Segoe UI" w:cs="Segoe UI"/>
+          <w:b/>
+          <w:bCs/>
+          <w:color w:val="F8FAFF"/>
+          <w:kern w:val="0"/>
+          <w:sz w:val="27"/>
+          <w:szCs w:val="27"/>
+          <w:lang w:eastAsia="en-GB"/>
+          <w14:ligatures w14:val="none"/>
+        </w:rPr>
+        <w:t>Created with a specific reference period and template</w:t>
+      </w:r>
+    </w:p>
+    <w:p>
+      <w:pPr>
+        <w:shd w:val="clear" w:color="auto" w:fill="292A2D"/>
+        <w:spacing w:after="206" w:line="240" w:lineRule="auto"/>
+        <w:outlineLvl w:val="2"/>
+        <w:rPr>
+          <w:rFonts w:ascii="Segoe UI" w:eastAsia="Times New Roman" w:hAnsi="Segoe UI" w:cs="Segoe UI"/>
+          <w:b/>
+          <w:bCs/>
+          <w:color w:val="F8FAFF"/>
+          <w:kern w:val="0"/>
+          <w:sz w:val="27"/>
+          <w:szCs w:val="27"/>
+          <w:lang w:eastAsia="en-GB"/>
+          <w14:ligatures w14:val="none"/>
+        </w:rPr>
+      </w:pPr>
+      <w:r>
+        <w:rPr>
+          <w:rFonts w:ascii="Segoe UI" w:eastAsia="Times New Roman" w:hAnsi="Segoe UI" w:cs="Segoe UI"/>
+          <w:b/>
+          <w:bCs/>
+          <w:color w:val="F8FAFF"/>
+          <w:kern w:val="0"/>
+          <w:sz w:val="27"/>
+          <w:szCs w:val="27"/>
+          <w:lang w:eastAsia="en-GB"/>
+          <w14:ligatures w14:val="none"/>
+        </w:rPr>
+        <w:t>Initially in "draft" status</w:t>
+      </w:r>
+    </w:p>
+    <w:p>
+      <w:pPr>
+        <w:shd w:val="clear" w:color="auto" w:fill="292A2D"/>
+        <w:spacing w:after="206" w:line="240" w:lineRule="auto"/>
+        <w:outlineLvl w:val="2"/>
+        <w:rPr>
+          <w:rFonts w:ascii="Segoe UI" w:eastAsia="Times New Roman" w:hAnsi="Segoe UI" w:cs="Segoe UI"/>
+          <w:b/>
+          <w:bCs/>
+          <w:color w:val="F8FAFF"/>
+          <w:kern w:val="0"/>
+          <w:sz w:val="27"/>
+          <w:szCs w:val="27"/>
+          <w:lang w:eastAsia="en-GB"/>
+          <w14:ligatures w14:val="none"/>
+        </w:rPr>
+      </w:pPr>
+      <w:r>
+        <w:rPr>
+          <w:rFonts w:ascii="Segoe UI" w:eastAsia="Times New Roman" w:hAnsi="Segoe UI" w:cs="Segoe UI"/>
+          <w:b/>
+          <w:bCs/>
+          <w:color w:val="F8FAFF"/>
+          <w:kern w:val="0"/>
+          <w:sz w:val="27"/>
+          <w:szCs w:val="27"/>
+          <w:lang w:eastAsia="en-GB"/>
+          <w14:ligatures w14:val="none"/>
+        </w:rPr>
+        <w:t xml:space="preserve">Has a </w:t>
+      </w:r>
+      <w:proofErr w:type="spellStart"/>
+      <w:r>
+        <w:rPr>
+          <w:rFonts w:ascii="Segoe UI" w:eastAsia="Times New Roman" w:hAnsi="Segoe UI" w:cs="Segoe UI"/>
+          <w:b/>
+          <w:bCs/>
+          <w:color w:val="F8FAFF"/>
+          <w:kern w:val="0"/>
+          <w:sz w:val="27"/>
+          <w:szCs w:val="27"/>
+          <w:lang w:eastAsia="en-GB"/>
+          <w14:ligatures w14:val="none"/>
+        </w:rPr>
+        <w:t>shareAmount</w:t>
+      </w:r>
+      <w:proofErr w:type="spellEnd"/>
+      <w:r>
+        <w:rPr>
+          <w:rFonts w:ascii="Segoe UI" w:eastAsia="Times New Roman" w:hAnsi="Segoe UI" w:cs="Segoe UI"/>
+          <w:b/>
+          <w:bCs/>
+          <w:color w:val="F8FAFF"/>
+          <w:kern w:val="0"/>
+          <w:sz w:val="27"/>
+          <w:szCs w:val="27"/>
+          <w:lang w:eastAsia="en-GB"/>
+          <w14:ligatures w14:val="none"/>
+        </w:rPr>
+        <w:t xml:space="preserve"> that determines the value of each "part"</w:t>
+      </w:r>
+    </w:p>
+    <w:p>
+      <w:pPr>
+        <w:shd w:val="clear" w:color="auto" w:fill="292A2D"/>
+        <w:spacing w:after="206" w:line="240" w:lineRule="auto"/>
+        <w:outlineLvl w:val="2"/>
+        <w:rPr>
+          <w:rFonts w:ascii="Segoe UI" w:eastAsia="Times New Roman" w:hAnsi="Segoe UI" w:cs="Segoe UI"/>
+          <w:b/>
+          <w:bCs/>
+          <w:color w:val="F8FAFF"/>
+          <w:kern w:val="0"/>
+          <w:sz w:val="27"/>
+          <w:szCs w:val="27"/>
+          <w:lang w:eastAsia="en-GB"/>
+          <w14:ligatures w14:val="none"/>
+        </w:rPr>
+      </w:pPr>
+      <w:r>
+        <w:rPr>
+          <w:rFonts w:ascii="Segoe UI" w:eastAsia="Times New Roman" w:hAnsi="Segoe UI" w:cs="Segoe UI"/>
+          <w:b/>
+          <w:bCs/>
+          <w:color w:val="F8FAFF"/>
+          <w:kern w:val="0"/>
+          <w:sz w:val="27"/>
+          <w:szCs w:val="27"/>
+          <w:lang w:eastAsia="en-GB"/>
+          <w14:ligatures w14:val="none"/>
+        </w:rPr>
+        <w:t>Can be reviewed and modified before approval</w:t>
+      </w:r>
+    </w:p>
+    <w:p>
+      <w:pPr>
+        <w:shd w:val="clear" w:color="auto" w:fill="292A2D"/>
+        <w:spacing w:after="206" w:line="240" w:lineRule="auto"/>
+        <w:outlineLvl w:val="2"/>
+        <w:rPr>
+          <w:rFonts w:ascii="Segoe UI" w:eastAsia="Times New Roman" w:hAnsi="Segoe UI" w:cs="Segoe UI"/>
+          <w:b/>
+          <w:bCs/>
+          <w:color w:val="F8FAFF"/>
+          <w:kern w:val="0"/>
+          <w:sz w:val="27"/>
+          <w:szCs w:val="27"/>
+          <w:lang w:eastAsia="en-GB"/>
+          <w14:ligatures w14:val="none"/>
+        </w:rPr>
+      </w:pPr>
+      <w:proofErr w:type="spellStart"/>
+      <w:r>
+        <w:rPr>
+          <w:rFonts w:ascii="Segoe UI" w:eastAsia="Times New Roman" w:hAnsi="Segoe UI" w:cs="Segoe UI"/>
+          <w:b/>
+          <w:bCs/>
+          <w:color w:val="F8FAFF"/>
+          <w:kern w:val="0"/>
+          <w:sz w:val="27"/>
+          <w:szCs w:val="27"/>
+          <w:lang w:eastAsia="en-GB"/>
+          <w14:ligatures w14:val="none"/>
+        </w:rPr>
+        <w:t>PersonnelSnapshot</w:t>
+      </w:r>
+      <w:proofErr w:type="spellEnd"/>
+      <w:r>
+        <w:rPr>
+          <w:rFonts w:ascii="Segoe UI" w:eastAsia="Times New Roman" w:hAnsi="Segoe UI" w:cs="Segoe UI"/>
+          <w:b/>
+          <w:bCs/>
+          <w:color w:val="F8FAFF"/>
+          <w:kern w:val="0"/>
+          <w:sz w:val="27"/>
+          <w:szCs w:val="27"/>
+          <w:lang w:eastAsia="en-GB"/>
+          <w14:ligatures w14:val="none"/>
+        </w:rPr>
+        <w:t>: Captures the state of personnel at a specific point in time</w:t>
+      </w:r>
+    </w:p>
+    <w:p>
+      <w:pPr>
+        <w:shd w:val="clear" w:color="auto" w:fill="292A2D"/>
+        <w:spacing w:after="206" w:line="240" w:lineRule="auto"/>
+        <w:outlineLvl w:val="2"/>
+        <w:rPr>
+          <w:rFonts w:ascii="Segoe UI" w:eastAsia="Times New Roman" w:hAnsi="Segoe UI" w:cs="Segoe UI"/>
+          <w:b/>
+          <w:bCs/>
+          <w:color w:val="F8FAFF"/>
+          <w:kern w:val="0"/>
+          <w:sz w:val="27"/>
+          <w:szCs w:val="27"/>
+          <w:lang w:eastAsia="en-GB"/>
+          <w14:ligatures w14:val="none"/>
+        </w:rPr>
+      </w:pPr>
+      <w:r>
+        <w:rPr>
+          <w:rFonts w:ascii="Segoe UI" w:eastAsia="Times New Roman" w:hAnsi="Segoe UI" w:cs="Segoe UI"/>
+          <w:b/>
+          <w:bCs/>
+          <w:color w:val="F8FAFF"/>
+          <w:kern w:val="0"/>
+          <w:sz w:val="27"/>
+          <w:szCs w:val="27"/>
+          <w:lang w:eastAsia="en-GB"/>
+          <w14:ligatures w14:val="none"/>
+        </w:rPr>
+        <w:t>Contains data like grade, category, position, situation, sanctions</w:t>
+      </w:r>
+    </w:p>
+    <w:p>
+      <w:pPr>
+        <w:shd w:val="clear" w:color="auto" w:fill="292A2D"/>
+        <w:spacing w:after="206" w:line="240" w:lineRule="auto"/>
+        <w:outlineLvl w:val="2"/>
+        <w:rPr>
+          <w:rFonts w:ascii="Segoe UI" w:eastAsia="Times New Roman" w:hAnsi="Segoe UI" w:cs="Segoe UI"/>
+          <w:b/>
+          <w:bCs/>
+          <w:color w:val="F8FAFF"/>
+          <w:kern w:val="0"/>
+          <w:sz w:val="27"/>
+          <w:szCs w:val="27"/>
+          <w:lang w:eastAsia="en-GB"/>
+          <w14:ligatures w14:val="none"/>
+        </w:rPr>
+      </w:pPr>
+      <w:r>
+        <w:rPr>
+          <w:rFonts w:ascii="Segoe UI" w:eastAsia="Times New Roman" w:hAnsi="Segoe UI" w:cs="Segoe UI"/>
+          <w:b/>
+          <w:bCs/>
+          <w:color w:val="F8FAFF"/>
+          <w:kern w:val="0"/>
+          <w:sz w:val="27"/>
+          <w:szCs w:val="27"/>
+          <w:lang w:eastAsia="en-GB"/>
+          <w14:ligatures w14:val="none"/>
+        </w:rPr>
+        <w:t>Used to calculate bonus eligibility and amounts</w:t>
+      </w:r>
+    </w:p>
+    <w:p>
+      <w:pPr>
+        <w:shd w:val="clear" w:color="auto" w:fill="292A2D"/>
+        <w:spacing w:after="206" w:line="240" w:lineRule="auto"/>
+        <w:outlineLvl w:val="2"/>
+        <w:rPr>
+          <w:rFonts w:ascii="Segoe UI" w:eastAsia="Times New Roman" w:hAnsi="Segoe UI" w:cs="Segoe UI"/>
+          <w:b/>
+          <w:bCs/>
+          <w:color w:val="F8FAFF"/>
+          <w:kern w:val="0"/>
+          <w:sz w:val="27"/>
+          <w:szCs w:val="27"/>
+          <w:lang w:eastAsia="en-GB"/>
+          <w14:ligatures w14:val="none"/>
+        </w:rPr>
+      </w:pPr>
+      <w:r>
+        <w:rPr>
+          <w:rFonts w:ascii="Segoe UI" w:eastAsia="Times New Roman" w:hAnsi="Segoe UI" w:cs="Segoe UI"/>
+          <w:b/>
+          <w:bCs/>
+          <w:color w:val="F8FAFF"/>
+          <w:kern w:val="0"/>
+          <w:sz w:val="27"/>
+          <w:szCs w:val="27"/>
+          <w:lang w:eastAsia="en-GB"/>
+          <w14:ligatures w14:val="none"/>
+        </w:rPr>
+        <w:t>Created when an instance is generated to "freeze" personnel state</w:t>
+      </w:r>
+    </w:p>
+    <w:p>
+      <w:pPr>
+        <w:shd w:val="clear" w:color="auto" w:fill="292A2D"/>
+        <w:spacing w:after="206" w:line="240" w:lineRule="auto"/>
+        <w:outlineLvl w:val="2"/>
+        <w:rPr>
+          <w:rFonts w:ascii="Segoe UI" w:eastAsia="Times New Roman" w:hAnsi="Segoe UI" w:cs="Segoe UI"/>
+          <w:b/>
+          <w:bCs/>
+          <w:color w:val="F8FAFF"/>
+          <w:kern w:val="0"/>
+          <w:sz w:val="27"/>
+          <w:szCs w:val="27"/>
+          <w:lang w:eastAsia="en-GB"/>
+          <w14:ligatures w14:val="none"/>
+        </w:rPr>
+      </w:pPr>
+      <w:r>
+        <w:rPr>
+          <w:rFonts w:ascii="Segoe UI" w:eastAsia="Times New Roman" w:hAnsi="Segoe UI" w:cs="Segoe UI"/>
+          <w:b/>
+          <w:bCs/>
+          <w:color w:val="F8FAFF"/>
+          <w:kern w:val="0"/>
+          <w:sz w:val="27"/>
+          <w:szCs w:val="27"/>
+          <w:lang w:eastAsia="en-GB"/>
+          <w14:ligatures w14:val="none"/>
+        </w:rPr>
+        <w:t>Process:</w:t>
+      </w:r>
+    </w:p>
+    <w:p>
+      <w:pPr>
+        <w:shd w:val="clear" w:color="auto" w:fill="292A2D"/>
+        <w:spacing w:after="206" w:line="240" w:lineRule="auto"/>
+        <w:outlineLvl w:val="2"/>
+        <w:rPr>
+          <w:rFonts w:ascii="Segoe UI" w:eastAsia="Times New Roman" w:hAnsi="Segoe UI" w:cs="Segoe UI"/>
+          <w:b/>
+          <w:bCs/>
+          <w:color w:val="F8FAFF"/>
+          <w:kern w:val="0"/>
+          <w:sz w:val="27"/>
+          <w:szCs w:val="27"/>
+          <w:lang w:eastAsia="en-GB"/>
+          <w14:ligatures w14:val="none"/>
+        </w:rPr>
+      </w:pPr>
+      <w:r>
+        <w:rPr>
+          <w:rFonts w:ascii="Segoe UI" w:eastAsia="Times New Roman" w:hAnsi="Segoe UI" w:cs="Segoe UI"/>
+          <w:b/>
+          <w:bCs/>
+          <w:color w:val="F8FAFF"/>
+          <w:kern w:val="0"/>
+          <w:sz w:val="27"/>
+          <w:szCs w:val="27"/>
+          <w:lang w:eastAsia="en-GB"/>
+          <w14:ligatures w14:val="none"/>
+        </w:rPr>
+        <w:t xml:space="preserve">When a </w:t>
+      </w:r>
+      <w:proofErr w:type="spellStart"/>
+      <w:r>
+        <w:rPr>
+          <w:rFonts w:ascii="Segoe UI" w:eastAsia="Times New Roman" w:hAnsi="Segoe UI" w:cs="Segoe UI"/>
+          <w:b/>
+          <w:bCs/>
+          <w:color w:val="F8FAFF"/>
+          <w:kern w:val="0"/>
+          <w:sz w:val="27"/>
+          <w:szCs w:val="27"/>
+          <w:lang w:eastAsia="en-GB"/>
+          <w14:ligatures w14:val="none"/>
+        </w:rPr>
+        <w:t>BonusInstance</w:t>
+      </w:r>
+      <w:proofErr w:type="spellEnd"/>
+      <w:r>
+        <w:rPr>
+          <w:rFonts w:ascii="Segoe UI" w:eastAsia="Times New Roman" w:hAnsi="Segoe UI" w:cs="Segoe UI"/>
+          <w:b/>
+          <w:bCs/>
+          <w:color w:val="F8FAFF"/>
+          <w:kern w:val="0"/>
+          <w:sz w:val="27"/>
+          <w:szCs w:val="27"/>
+          <w:lang w:eastAsia="en-GB"/>
+          <w14:ligatures w14:val="none"/>
+        </w:rPr>
+        <w:t xml:space="preserve"> is created, the system takes snapshots of all relevant personnel</w:t>
+      </w:r>
+    </w:p>
+    <w:p>
+      <w:pPr>
+        <w:shd w:val="clear" w:color="auto" w:fill="292A2D"/>
+        <w:spacing w:after="206" w:line="240" w:lineRule="auto"/>
+        <w:outlineLvl w:val="2"/>
+        <w:rPr>
+          <w:rFonts w:ascii="Segoe UI" w:eastAsia="Times New Roman" w:hAnsi="Segoe UI" w:cs="Segoe UI"/>
+          <w:b/>
+          <w:bCs/>
+          <w:color w:val="F8FAFF"/>
+          <w:kern w:val="0"/>
+          <w:sz w:val="27"/>
+          <w:szCs w:val="27"/>
+          <w:lang w:eastAsia="en-GB"/>
+          <w14:ligatures w14:val="none"/>
+        </w:rPr>
+      </w:pPr>
+      <w:r>
+        <w:rPr>
+          <w:rFonts w:ascii="Segoe UI" w:eastAsia="Times New Roman" w:hAnsi="Segoe UI" w:cs="Segoe UI"/>
+          <w:b/>
+          <w:bCs/>
+          <w:color w:val="F8FAFF"/>
+          <w:kern w:val="0"/>
+          <w:sz w:val="27"/>
+          <w:szCs w:val="27"/>
+          <w:lang w:eastAsia="en-GB"/>
+          <w14:ligatures w14:val="none"/>
+        </w:rPr>
+        <w:t>Bonus allocations are calculated based on these snapshots</w:t>
+      </w:r>
+    </w:p>
+    <w:p>
+      <w:pPr>
+        <w:shd w:val="clear" w:color="auto" w:fill="292A2D"/>
+        <w:spacing w:after="206" w:line="240" w:lineRule="auto"/>
+        <w:outlineLvl w:val="2"/>
+        <w:rPr>
+          <w:rFonts w:ascii="Segoe UI" w:eastAsia="Times New Roman" w:hAnsi="Segoe UI" w:cs="Segoe UI"/>
+          <w:b/>
+          <w:bCs/>
+          <w:color w:val="F8FAFF"/>
+          <w:kern w:val="0"/>
+          <w:sz w:val="27"/>
+          <w:szCs w:val="27"/>
+          <w:lang w:eastAsia="en-GB"/>
+          <w14:ligatures w14:val="none"/>
+        </w:rPr>
+      </w:pPr>
+      <w:r>
+        <w:rPr>
+          <w:rFonts w:ascii="Segoe UI" w:eastAsia="Times New Roman" w:hAnsi="Segoe UI" w:cs="Segoe UI"/>
+          <w:b/>
+          <w:bCs/>
+          <w:color w:val="F8FAFF"/>
+          <w:kern w:val="0"/>
+          <w:sz w:val="27"/>
+          <w:szCs w:val="27"/>
+          <w:lang w:eastAsia="en-GB"/>
+          <w14:ligatures w14:val="none"/>
+        </w:rPr>
+        <w:t>Users can review and adjust allocations</w:t>
+      </w:r>
+    </w:p>
+    <w:p>
+      <w:pPr>
+        <w:shd w:val="clear" w:color="auto" w:fill="292A2D"/>
+        <w:spacing w:after="206" w:line="240" w:lineRule="auto"/>
+        <w:outlineLvl w:val="2"/>
+        <w:rPr>
+          <w:rFonts w:ascii="Segoe UI" w:eastAsia="Times New Roman" w:hAnsi="Segoe UI" w:cs="Segoe UI"/>
+          <w:b/>
+          <w:bCs/>
+          <w:color w:val="F8FAFF"/>
+          <w:kern w:val="0"/>
+          <w:sz w:val="27"/>
+          <w:szCs w:val="27"/>
+          <w:lang w:eastAsia="en-GB"/>
+          <w14:ligatures w14:val="none"/>
+        </w:rPr>
+      </w:pPr>
+      <w:r>
+        <w:rPr>
+          <w:rFonts w:ascii="Segoe UI" w:eastAsia="Times New Roman" w:hAnsi="Segoe UI" w:cs="Segoe UI"/>
+          <w:b/>
+          <w:bCs/>
+          <w:color w:val="F8FAFF"/>
+          <w:kern w:val="0"/>
+          <w:sz w:val="27"/>
+          <w:szCs w:val="27"/>
+          <w:lang w:eastAsia="en-GB"/>
+          <w14:ligatures w14:val="none"/>
+        </w:rPr>
+        <w:t>Once confirmed, the instance can be approved and exported for payment</w:t>
+      </w:r>
+    </w:p>
+    <w:p>
+      <w:pPr>
+        <w:shd w:val="clear" w:color="auto" w:fill="292A2D"/>
+        <w:spacing w:after="206" w:line="240" w:lineRule="auto"/>
+        <w:outlineLvl w:val="2"/>
+        <w:rPr>
+          <w:rFonts w:ascii="Segoe UI" w:eastAsia="Times New Roman" w:hAnsi="Segoe UI" w:cs="Segoe UI"/>
+          <w:b/>
+          <w:bCs/>
+          <w:color w:val="F8FAFF"/>
+          <w:kern w:val="0"/>
+          <w:sz w:val="27"/>
+          <w:szCs w:val="27"/>
+          <w:lang w:eastAsia="en-GB"/>
+          <w14:ligatures w14:val="none"/>
+        </w:rPr>
+      </w:pPr>
+      <w:r>
+        <w:rPr>
+          <w:rFonts w:ascii="Segoe UI" w:eastAsia="Times New Roman" w:hAnsi="Segoe UI" w:cs="Segoe UI"/>
+          <w:b/>
+          <w:bCs/>
+          <w:color w:val="F8FAFF"/>
+          <w:kern w:val="0"/>
+          <w:sz w:val="27"/>
+          <w:szCs w:val="27"/>
+          <w:lang w:eastAsia="en-GB"/>
+          <w14:ligatures w14:val="none"/>
+        </w:rPr>
+        <w:lastRenderedPageBreak/>
+        <w:t>Key Point: Even if a personnel's situation changes later, the bonus is still calculated based on the snapshot taken when the instance was generated.</w:t>
+      </w:r>
+    </w:p>
+    <w:p>
+      <w:pPr>
+        <w:shd w:val="clear" w:color="auto" w:fill="292A2D"/>
+        <w:spacing w:after="206" w:line="240" w:lineRule="auto"/>
+        <w:outlineLvl w:val="2"/>
+        <w:rPr>
+          <w:rFonts w:ascii="Segoe UI" w:eastAsia="Times New Roman" w:hAnsi="Segoe UI" w:cs="Segoe UI"/>
+          <w:b/>
+          <w:bCs/>
+          <w:color w:val="F8FAFF"/>
+          <w:kern w:val="0"/>
+          <w:sz w:val="27"/>
+          <w:szCs w:val="27"/>
+          <w:lang w:eastAsia="en-GB"/>
+          <w14:ligatures w14:val="none"/>
+        </w:rPr>
+      </w:pPr>
+      <w:r>
+        <w:rPr>
+          <w:rFonts w:ascii="Segoe UI" w:eastAsia="Times New Roman" w:hAnsi="Segoe UI" w:cs="Segoe UI"/>
+          <w:b/>
+          <w:bCs/>
+          <w:color w:val="F8FAFF"/>
+          <w:kern w:val="0"/>
+          <w:sz w:val="27"/>
+          <w:szCs w:val="27"/>
+          <w:lang w:eastAsia="en-GB"/>
+          <w14:ligatures w14:val="none"/>
+        </w:rPr>
+        <w:t xml:space="preserve">Me </w:t>
+      </w:r>
+      <w:r>
+        <w:rPr>
+          <w:rFonts w:ascii="Segoe UI" w:eastAsia="Times New Roman" w:hAnsi="Segoe UI" w:cs="Segoe UI"/>
+          <w:b/>
+          <w:bCs/>
+          <w:color w:val="F8FAFF"/>
+          <w:kern w:val="0"/>
+          <w:sz w:val="27"/>
+          <w:szCs w:val="27"/>
+          <w:lang w:eastAsia="en-GB"/>
+          <w14:ligatures w14:val="none"/>
+        </w:rPr>
+        <w:t>Clarifying Questions</w:t>
+      </w:r>
+    </w:p>
+    <w:p>
+      <w:pPr>
+        <w:shd w:val="clear" w:color="auto" w:fill="292A2D"/>
+        <w:spacing w:after="206" w:line="240" w:lineRule="auto"/>
+        <w:outlineLvl w:val="2"/>
+        <w:rPr>
+          <w:rFonts w:ascii="Segoe UI" w:eastAsia="Times New Roman" w:hAnsi="Segoe UI" w:cs="Segoe UI"/>
+          <w:b/>
+          <w:bCs/>
+          <w:color w:val="F8FAFF"/>
+          <w:kern w:val="0"/>
+          <w:sz w:val="27"/>
+          <w:szCs w:val="27"/>
+          <w:lang w:eastAsia="en-GB"/>
+          <w14:ligatures w14:val="none"/>
+        </w:rPr>
+      </w:pPr>
+      <w:r>
+        <w:rPr>
+          <w:rFonts w:ascii="Segoe UI" w:eastAsia="Times New Roman" w:hAnsi="Segoe UI" w:cs="Segoe UI"/>
+          <w:b/>
+          <w:bCs/>
+          <w:color w:val="F8FAFF"/>
+          <w:kern w:val="0"/>
+          <w:sz w:val="27"/>
+          <w:szCs w:val="27"/>
+          <w:lang w:eastAsia="en-GB"/>
+          <w14:ligatures w14:val="none"/>
+        </w:rPr>
+        <w:t>Snapshot Timing: Are snapshots created only once when the instance is initially generated, or can they be refreshed if the instance is still in draft status?</w:t>
+      </w:r>
+    </w:p>
+    <w:p>
+      <w:pPr>
+        <w:shd w:val="clear" w:color="auto" w:fill="292A2D"/>
+        <w:spacing w:after="206" w:line="240" w:lineRule="auto"/>
+        <w:outlineLvl w:val="2"/>
+        <w:rPr>
+          <w:rFonts w:ascii="Segoe UI" w:eastAsia="Times New Roman" w:hAnsi="Segoe UI" w:cs="Segoe UI"/>
+          <w:b/>
+          <w:bCs/>
+          <w:color w:val="F8FAFF"/>
+          <w:kern w:val="0"/>
+          <w:sz w:val="27"/>
+          <w:szCs w:val="27"/>
+          <w:lang w:eastAsia="en-GB"/>
+          <w14:ligatures w14:val="none"/>
+        </w:rPr>
+      </w:pPr>
+      <w:r>
+        <w:rPr>
+          <w:rFonts w:ascii="Segoe UI" w:eastAsia="Times New Roman" w:hAnsi="Segoe UI" w:cs="Segoe UI"/>
+          <w:b/>
+          <w:bCs/>
+          <w:color w:val="F8FAFF"/>
+          <w:kern w:val="0"/>
+          <w:sz w:val="27"/>
+          <w:szCs w:val="27"/>
+          <w:lang w:eastAsia="en-GB"/>
+          <w14:ligatures w14:val="none"/>
+        </w:rPr>
+        <w:t>Multiple Snapshots: Can there be multiple snapshots per person for the same instance (e.g., if the instance is regenerated), or is there a one-to-one relationship?</w:t>
+      </w:r>
+    </w:p>
+    <w:p>
+      <w:pPr>
+        <w:shd w:val="clear" w:color="auto" w:fill="292A2D"/>
+        <w:spacing w:after="206" w:line="240" w:lineRule="auto"/>
+        <w:outlineLvl w:val="2"/>
+        <w:rPr>
+          <w:rFonts w:ascii="Segoe UI" w:eastAsia="Times New Roman" w:hAnsi="Segoe UI" w:cs="Segoe UI"/>
+          <w:b/>
+          <w:bCs/>
+          <w:color w:val="F8FAFF"/>
+          <w:kern w:val="0"/>
+          <w:sz w:val="27"/>
+          <w:szCs w:val="27"/>
+          <w:lang w:eastAsia="en-GB"/>
+          <w14:ligatures w14:val="none"/>
+        </w:rPr>
+      </w:pPr>
+      <w:r>
+        <w:rPr>
+          <w:rFonts w:ascii="Segoe UI" w:eastAsia="Times New Roman" w:hAnsi="Segoe UI" w:cs="Segoe UI"/>
+          <w:b/>
+          <w:bCs/>
+          <w:color w:val="F8FAFF"/>
+          <w:kern w:val="0"/>
+          <w:sz w:val="27"/>
+          <w:szCs w:val="27"/>
+          <w:lang w:eastAsia="en-GB"/>
+          <w14:ligatures w14:val="none"/>
+        </w:rPr>
+        <w:t>Allocation Adjustment: When users adjust allocations in step 1, are they changing the calculation inputs (e.g., parts), or just the final amount?</w:t>
+      </w:r>
+    </w:p>
+    <w:p>
+      <w:pPr>
+        <w:shd w:val="clear" w:color="auto" w:fill="292A2D"/>
+        <w:spacing w:after="206" w:line="240" w:lineRule="auto"/>
+        <w:outlineLvl w:val="2"/>
+        <w:rPr>
+          <w:rFonts w:ascii="Segoe UI" w:eastAsia="Times New Roman" w:hAnsi="Segoe UI" w:cs="Segoe UI"/>
+          <w:b/>
+          <w:bCs/>
+          <w:color w:val="F8FAFF"/>
+          <w:kern w:val="0"/>
+          <w:sz w:val="27"/>
+          <w:szCs w:val="27"/>
+          <w:lang w:eastAsia="en-GB"/>
+          <w14:ligatures w14:val="none"/>
+        </w:rPr>
+      </w:pPr>
+      <w:r>
+        <w:rPr>
+          <w:rFonts w:ascii="Segoe UI" w:eastAsia="Times New Roman" w:hAnsi="Segoe UI" w:cs="Segoe UI"/>
+          <w:b/>
+          <w:bCs/>
+          <w:color w:val="F8FAFF"/>
+          <w:kern w:val="0"/>
+          <w:sz w:val="27"/>
+          <w:szCs w:val="27"/>
+          <w:lang w:eastAsia="en-GB"/>
+          <w14:ligatures w14:val="none"/>
+        </w:rPr>
+        <w:t>Status Changes: If an instance moves from "draft" to "</w:t>
+      </w:r>
+      <w:proofErr w:type="spellStart"/>
+      <w:r>
+        <w:rPr>
+          <w:rFonts w:ascii="Segoe UI" w:eastAsia="Times New Roman" w:hAnsi="Segoe UI" w:cs="Segoe UI"/>
+          <w:b/>
+          <w:bCs/>
+          <w:color w:val="F8FAFF"/>
+          <w:kern w:val="0"/>
+          <w:sz w:val="27"/>
+          <w:szCs w:val="27"/>
+          <w:lang w:eastAsia="en-GB"/>
+          <w14:ligatures w14:val="none"/>
+        </w:rPr>
+        <w:t>under_review</w:t>
+      </w:r>
+      <w:proofErr w:type="spellEnd"/>
+      <w:r>
+        <w:rPr>
+          <w:rFonts w:ascii="Segoe UI" w:eastAsia="Times New Roman" w:hAnsi="Segoe UI" w:cs="Segoe UI"/>
+          <w:b/>
+          <w:bCs/>
+          <w:color w:val="F8FAFF"/>
+          <w:kern w:val="0"/>
+          <w:sz w:val="27"/>
+          <w:szCs w:val="27"/>
+          <w:lang w:eastAsia="en-GB"/>
+          <w14:ligatures w14:val="none"/>
+        </w:rPr>
+        <w:t>" and back to "draft", does this trigger any regeneration of snapshots or allocations?</w:t>
+      </w:r>
+    </w:p>
+    <w:p>
+      <w:pPr>
+        <w:shd w:val="clear" w:color="auto" w:fill="292A2D"/>
+        <w:spacing w:after="206" w:line="240" w:lineRule="auto"/>
+        <w:outlineLvl w:val="2"/>
+        <w:rPr>
+          <w:rFonts w:ascii="Segoe UI" w:eastAsia="Times New Roman" w:hAnsi="Segoe UI" w:cs="Segoe UI"/>
+          <w:b/>
+          <w:bCs/>
+          <w:color w:val="F8FAFF"/>
+          <w:kern w:val="0"/>
+          <w:sz w:val="27"/>
+          <w:szCs w:val="27"/>
+          <w:lang w:eastAsia="en-GB"/>
+          <w14:ligatures w14:val="none"/>
+        </w:rPr>
+      </w:pPr>
+      <w:r>
+        <w:rPr>
+          <w:rFonts w:ascii="Segoe UI" w:eastAsia="Times New Roman" w:hAnsi="Segoe UI" w:cs="Segoe UI"/>
+          <w:b/>
+          <w:bCs/>
+          <w:color w:val="F8FAFF"/>
+          <w:kern w:val="0"/>
+          <w:sz w:val="27"/>
+          <w:szCs w:val="27"/>
+          <w:lang w:eastAsia="en-GB"/>
+          <w14:ligatures w14:val="none"/>
+        </w:rPr>
+        <w:t>Historical View: If I open a previously approved instance from last year, will I see the personnel snapshots as they were at that time, or with current data?</w:t>
+      </w:r>
+    </w:p>
+    <w:p>
+      <w:pPr>
+        <w:shd w:val="clear" w:color="auto" w:fill="292A2D"/>
+        <w:spacing w:after="206" w:line="240" w:lineRule="auto"/>
+        <w:outlineLvl w:val="2"/>
+        <w:rPr>
+          <w:rFonts w:ascii="Segoe UI" w:eastAsia="Times New Roman" w:hAnsi="Segoe UI" w:cs="Segoe UI"/>
+          <w:b/>
+          <w:bCs/>
+          <w:color w:val="F8FAFF"/>
+          <w:kern w:val="0"/>
+          <w:sz w:val="27"/>
+          <w:szCs w:val="27"/>
+          <w:lang w:eastAsia="en-GB"/>
+          <w14:ligatures w14:val="none"/>
+        </w:rPr>
+      </w:pPr>
+    </w:p>
+    <w:p>
+      <w:pPr>
+        <w:shd w:val="clear" w:color="auto" w:fill="292A2D"/>
+        <w:spacing w:after="206" w:line="240" w:lineRule="auto"/>
+        <w:outlineLvl w:val="2"/>
+        <w:rPr>
+          <w:rFonts w:ascii="Segoe UI" w:eastAsia="Times New Roman" w:hAnsi="Segoe UI" w:cs="Segoe UI"/>
+          <w:b/>
+          <w:bCs/>
+          <w:color w:val="F8FAFF"/>
+          <w:kern w:val="0"/>
+          <w:sz w:val="27"/>
+          <w:szCs w:val="27"/>
+          <w:lang w:eastAsia="en-GB"/>
+          <w14:ligatures w14:val="none"/>
+        </w:rPr>
+      </w:pPr>
+      <w:r>
+        <w:rPr>
+          <w:rFonts w:ascii="Segoe UI" w:eastAsia="Times New Roman" w:hAnsi="Segoe UI" w:cs="Segoe UI"/>
+          <w:b/>
+          <w:bCs/>
+          <w:color w:val="F8FAFF"/>
+          <w:kern w:val="0"/>
+          <w:sz w:val="27"/>
+          <w:szCs w:val="27"/>
+          <w:lang w:eastAsia="en-GB"/>
+          <w14:ligatures w14:val="none"/>
+        </w:rPr>
+        <w:t>You</w:t>
+      </w:r>
+    </w:p>
+    <w:p>
+      <w:pPr>
+        <w:shd w:val="clear" w:color="auto" w:fill="292A2D"/>
+        <w:spacing w:after="206" w:line="240" w:lineRule="auto"/>
+        <w:outlineLvl w:val="2"/>
+        <w:rPr>
+          <w:rFonts w:ascii="Segoe UI" w:eastAsia="Times New Roman" w:hAnsi="Segoe UI" w:cs="Segoe UI"/>
+          <w:b/>
+          <w:bCs/>
+          <w:color w:val="F8FAFF"/>
+          <w:kern w:val="0"/>
+          <w:sz w:val="27"/>
+          <w:szCs w:val="27"/>
+          <w:lang w:eastAsia="en-GB"/>
+          <w14:ligatures w14:val="none"/>
+        </w:rPr>
+      </w:pPr>
+      <w:r>
+        <w:rPr>
+          <w:rFonts w:ascii="Segoe UI" w:eastAsia="Times New Roman" w:hAnsi="Segoe UI" w:cs="Segoe UI"/>
+          <w:b/>
+          <w:bCs/>
+          <w:color w:val="F8FAFF"/>
+          <w:kern w:val="0"/>
+          <w:sz w:val="27"/>
+          <w:szCs w:val="27"/>
+          <w:lang w:eastAsia="en-GB"/>
+          <w14:ligatures w14:val="none"/>
+        </w:rPr>
+        <w:t>Thank you for answering my questions. I now have a clearer understanding of how the system should work:</w:t>
+      </w:r>
+    </w:p>
+    <w:p>
+      <w:pPr>
+        <w:shd w:val="clear" w:color="auto" w:fill="292A2D"/>
+        <w:spacing w:after="206" w:line="240" w:lineRule="auto"/>
+        <w:outlineLvl w:val="2"/>
+        <w:rPr>
+          <w:rFonts w:ascii="Segoe UI" w:eastAsia="Times New Roman" w:hAnsi="Segoe UI" w:cs="Segoe UI"/>
+          <w:b/>
+          <w:bCs/>
+          <w:color w:val="F8FAFF"/>
+          <w:kern w:val="0"/>
+          <w:sz w:val="27"/>
+          <w:szCs w:val="27"/>
+          <w:lang w:eastAsia="en-GB"/>
+          <w14:ligatures w14:val="none"/>
+        </w:rPr>
+      </w:pPr>
+      <w:r>
+        <w:rPr>
+          <w:rFonts w:ascii="Segoe UI" w:eastAsia="Times New Roman" w:hAnsi="Segoe UI" w:cs="Segoe UI"/>
+          <w:b/>
+          <w:bCs/>
+          <w:color w:val="F8FAFF"/>
+          <w:kern w:val="0"/>
+          <w:sz w:val="27"/>
+          <w:szCs w:val="27"/>
+          <w:lang w:eastAsia="en-GB"/>
+          <w14:ligatures w14:val="none"/>
+        </w:rPr>
+        <w:t>One-time Snapshot: A snapshot is created only once when the instance is generated, capturing the state of personnel at that specific point in time. This snapshot becomes the fixed reference point for all bonus calculations for that instance.</w:t>
+      </w:r>
+    </w:p>
+    <w:p>
+      <w:pPr>
+        <w:shd w:val="clear" w:color="auto" w:fill="292A2D"/>
+        <w:spacing w:after="206" w:line="240" w:lineRule="auto"/>
+        <w:outlineLvl w:val="2"/>
+        <w:rPr>
+          <w:rFonts w:ascii="Segoe UI" w:eastAsia="Times New Roman" w:hAnsi="Segoe UI" w:cs="Segoe UI"/>
+          <w:b/>
+          <w:bCs/>
+          <w:color w:val="F8FAFF"/>
+          <w:kern w:val="0"/>
+          <w:sz w:val="27"/>
+          <w:szCs w:val="27"/>
+          <w:lang w:eastAsia="en-GB"/>
+          <w14:ligatures w14:val="none"/>
+        </w:rPr>
+      </w:pPr>
+      <w:r>
+        <w:rPr>
+          <w:rFonts w:ascii="Segoe UI" w:eastAsia="Times New Roman" w:hAnsi="Segoe UI" w:cs="Segoe UI"/>
+          <w:b/>
+          <w:bCs/>
+          <w:color w:val="F8FAFF"/>
+          <w:kern w:val="0"/>
+          <w:sz w:val="27"/>
+          <w:szCs w:val="27"/>
+          <w:lang w:eastAsia="en-GB"/>
+          <w14:ligatures w14:val="none"/>
+        </w:rPr>
+        <w:t xml:space="preserve">One Snapshot per Personnel per Instance: Each personnel </w:t>
+      </w:r>
+      <w:proofErr w:type="gramStart"/>
+      <w:r>
+        <w:rPr>
+          <w:rFonts w:ascii="Segoe UI" w:eastAsia="Times New Roman" w:hAnsi="Segoe UI" w:cs="Segoe UI"/>
+          <w:b/>
+          <w:bCs/>
+          <w:color w:val="F8FAFF"/>
+          <w:kern w:val="0"/>
+          <w:sz w:val="27"/>
+          <w:szCs w:val="27"/>
+          <w:lang w:eastAsia="en-GB"/>
+          <w14:ligatures w14:val="none"/>
+        </w:rPr>
+        <w:t>has</w:t>
+      </w:r>
+      <w:proofErr w:type="gramEnd"/>
+      <w:r>
+        <w:rPr>
+          <w:rFonts w:ascii="Segoe UI" w:eastAsia="Times New Roman" w:hAnsi="Segoe UI" w:cs="Segoe UI"/>
+          <w:b/>
+          <w:bCs/>
+          <w:color w:val="F8FAFF"/>
+          <w:kern w:val="0"/>
+          <w:sz w:val="27"/>
+          <w:szCs w:val="27"/>
+          <w:lang w:eastAsia="en-GB"/>
+          <w14:ligatures w14:val="none"/>
+        </w:rPr>
+        <w:t xml:space="preserve"> exactly one snapshot associated with a particular instance.</w:t>
+      </w:r>
+    </w:p>
+    <w:p>
+      <w:pPr>
+        <w:shd w:val="clear" w:color="auto" w:fill="292A2D"/>
+        <w:spacing w:after="206" w:line="240" w:lineRule="auto"/>
+        <w:outlineLvl w:val="2"/>
+        <w:rPr>
+          <w:rFonts w:ascii="Segoe UI" w:eastAsia="Times New Roman" w:hAnsi="Segoe UI" w:cs="Segoe UI"/>
+          <w:b/>
+          <w:bCs/>
+          <w:color w:val="F8FAFF"/>
+          <w:kern w:val="0"/>
+          <w:sz w:val="27"/>
+          <w:szCs w:val="27"/>
+          <w:lang w:eastAsia="en-GB"/>
+          <w14:ligatures w14:val="none"/>
+        </w:rPr>
+      </w:pPr>
+      <w:r>
+        <w:rPr>
+          <w:rFonts w:ascii="Segoe UI" w:eastAsia="Times New Roman" w:hAnsi="Segoe UI" w:cs="Segoe UI"/>
+          <w:b/>
+          <w:bCs/>
+          <w:color w:val="F8FAFF"/>
+          <w:kern w:val="0"/>
+          <w:sz w:val="27"/>
+          <w:szCs w:val="27"/>
+          <w:lang w:eastAsia="en-GB"/>
+          <w14:ligatures w14:val="none"/>
+        </w:rPr>
+        <w:lastRenderedPageBreak/>
+        <w:t>Allocation Adjustments: Users can manually adjust parts for personnel, which then recalculates the amount. A comment should be added to track this adjustment.</w:t>
+      </w:r>
+    </w:p>
+    <w:p>
+      <w:pPr>
+        <w:shd w:val="clear" w:color="auto" w:fill="292A2D"/>
+        <w:spacing w:after="206" w:line="240" w:lineRule="auto"/>
+        <w:outlineLvl w:val="2"/>
+        <w:rPr>
+          <w:rFonts w:ascii="Segoe UI" w:eastAsia="Times New Roman" w:hAnsi="Segoe UI" w:cs="Segoe UI"/>
+          <w:b/>
+          <w:bCs/>
+          <w:color w:val="F8FAFF"/>
+          <w:kern w:val="0"/>
+          <w:sz w:val="27"/>
+          <w:szCs w:val="27"/>
+          <w:lang w:eastAsia="en-GB"/>
+          <w14:ligatures w14:val="none"/>
+        </w:rPr>
+      </w:pPr>
+      <w:r>
+        <w:rPr>
+          <w:rFonts w:ascii="Segoe UI" w:eastAsia="Times New Roman" w:hAnsi="Segoe UI" w:cs="Segoe UI"/>
+          <w:b/>
+          <w:bCs/>
+          <w:color w:val="F8FAFF"/>
+          <w:kern w:val="0"/>
+          <w:sz w:val="27"/>
+          <w:szCs w:val="27"/>
+          <w:lang w:eastAsia="en-GB"/>
+          <w14:ligatures w14:val="none"/>
+        </w:rPr>
+        <w:t>Historical Integrity: The system maintains historical integrity - when viewing an instance from the past, you see the personnel data as it was at that time, not their current state.</w:t>
+      </w:r>
+    </w:p>
+    <w:p>
+      <w:pPr>
+        <w:shd w:val="clear" w:color="auto" w:fill="292A2D"/>
+        <w:spacing w:after="206" w:line="240" w:lineRule="auto"/>
+        <w:outlineLvl w:val="2"/>
+        <w:rPr>
+          <w:rFonts w:ascii="Segoe UI" w:eastAsia="Times New Roman" w:hAnsi="Segoe UI" w:cs="Segoe UI"/>
+          <w:b/>
+          <w:bCs/>
+          <w:color w:val="F8FAFF"/>
+          <w:kern w:val="0"/>
+          <w:sz w:val="27"/>
+          <w:szCs w:val="27"/>
+          <w:lang w:eastAsia="en-GB"/>
+          <w14:ligatures w14:val="none"/>
+        </w:rPr>
+      </w:pPr>
+      <w:r>
+        <w:rPr>
+          <w:rFonts w:ascii="Segoe UI" w:eastAsia="Times New Roman" w:hAnsi="Segoe UI" w:cs="Segoe UI"/>
+          <w:b/>
+          <w:bCs/>
+          <w:color w:val="F8FAFF"/>
+          <w:kern w:val="0"/>
+          <w:sz w:val="27"/>
+          <w:szCs w:val="27"/>
+          <w:lang w:eastAsia="en-GB"/>
+          <w14:ligatures w14:val="none"/>
+        </w:rPr>
+        <w:t xml:space="preserve">Based on this understanding, I can see that the relationship between </w:t>
+      </w:r>
+      <w:proofErr w:type="spellStart"/>
+      <w:r>
+        <w:rPr>
+          <w:rFonts w:ascii="Segoe UI" w:eastAsia="Times New Roman" w:hAnsi="Segoe UI" w:cs="Segoe UI"/>
+          <w:b/>
+          <w:bCs/>
+          <w:color w:val="F8FAFF"/>
+          <w:kern w:val="0"/>
+          <w:sz w:val="27"/>
+          <w:szCs w:val="27"/>
+          <w:lang w:eastAsia="en-GB"/>
+          <w14:ligatures w14:val="none"/>
+        </w:rPr>
+        <w:t>BonusInstance</w:t>
+      </w:r>
+      <w:proofErr w:type="spellEnd"/>
+      <w:r>
+        <w:rPr>
+          <w:rFonts w:ascii="Segoe UI" w:eastAsia="Times New Roman" w:hAnsi="Segoe UI" w:cs="Segoe UI"/>
+          <w:b/>
+          <w:bCs/>
+          <w:color w:val="F8FAFF"/>
+          <w:kern w:val="0"/>
+          <w:sz w:val="27"/>
+          <w:szCs w:val="27"/>
+          <w:lang w:eastAsia="en-GB"/>
+          <w14:ligatures w14:val="none"/>
+        </w:rPr>
+        <w:t xml:space="preserve">, </w:t>
+      </w:r>
+      <w:proofErr w:type="spellStart"/>
+      <w:r>
+        <w:rPr>
+          <w:rFonts w:ascii="Segoe UI" w:eastAsia="Times New Roman" w:hAnsi="Segoe UI" w:cs="Segoe UI"/>
+          <w:b/>
+          <w:bCs/>
+          <w:color w:val="F8FAFF"/>
+          <w:kern w:val="0"/>
+          <w:sz w:val="27"/>
+          <w:szCs w:val="27"/>
+          <w:lang w:eastAsia="en-GB"/>
+          <w14:ligatures w14:val="none"/>
+        </w:rPr>
+        <w:t>PersonnelSnapshot</w:t>
+      </w:r>
+      <w:proofErr w:type="spellEnd"/>
+      <w:r>
+        <w:rPr>
+          <w:rFonts w:ascii="Segoe UI" w:eastAsia="Times New Roman" w:hAnsi="Segoe UI" w:cs="Segoe UI"/>
+          <w:b/>
+          <w:bCs/>
+          <w:color w:val="F8FAFF"/>
+          <w:kern w:val="0"/>
+          <w:sz w:val="27"/>
+          <w:szCs w:val="27"/>
+          <w:lang w:eastAsia="en-GB"/>
+          <w14:ligatures w14:val="none"/>
+        </w:rPr>
+        <w:t xml:space="preserve">, and </w:t>
+      </w:r>
+      <w:proofErr w:type="spellStart"/>
+      <w:r>
+        <w:rPr>
+          <w:rFonts w:ascii="Segoe UI" w:eastAsia="Times New Roman" w:hAnsi="Segoe UI" w:cs="Segoe UI"/>
+          <w:b/>
+          <w:bCs/>
+          <w:color w:val="F8FAFF"/>
+          <w:kern w:val="0"/>
+          <w:sz w:val="27"/>
+          <w:szCs w:val="27"/>
+          <w:lang w:eastAsia="en-GB"/>
+          <w14:ligatures w14:val="none"/>
+        </w:rPr>
+        <w:t>BonusAllocation</w:t>
+      </w:r>
+      <w:proofErr w:type="spellEnd"/>
+      <w:r>
+        <w:rPr>
+          <w:rFonts w:ascii="Segoe UI" w:eastAsia="Times New Roman" w:hAnsi="Segoe UI" w:cs="Segoe UI"/>
+          <w:b/>
+          <w:bCs/>
+          <w:color w:val="F8FAFF"/>
+          <w:kern w:val="0"/>
+          <w:sz w:val="27"/>
+          <w:szCs w:val="27"/>
+          <w:lang w:eastAsia="en-GB"/>
+          <w14:ligatures w14:val="none"/>
+        </w:rPr>
+        <w:t xml:space="preserve"> is correctly designed to support this temporal requirement. The snapshot serves as the "frozen" state of personnel data at the time the instance was created, ensuring that even if personnel data changes in the future, the bonus calculations remain based on the data as it was during the reference period.</w:t>
+      </w:r>
+    </w:p>
+    <w:p>
+      <w:pPr>
+        <w:shd w:val="clear" w:color="auto" w:fill="292A2D"/>
+        <w:spacing w:after="206" w:line="240" w:lineRule="auto"/>
+        <w:outlineLvl w:val="2"/>
+        <w:rPr>
+          <w:rFonts w:ascii="Segoe UI" w:eastAsia="Times New Roman" w:hAnsi="Segoe UI" w:cs="Segoe UI"/>
+          <w:b/>
+          <w:bCs/>
+          <w:color w:val="F8FAFF"/>
+          <w:kern w:val="0"/>
+          <w:sz w:val="27"/>
+          <w:szCs w:val="27"/>
+          <w:lang w:eastAsia="en-GB"/>
+          <w14:ligatures w14:val="none"/>
+        </w:rPr>
+      </w:pPr>
+      <w:r>
+        <w:rPr>
+          <w:rFonts w:ascii="Segoe UI" w:eastAsia="Times New Roman" w:hAnsi="Segoe UI" w:cs="Segoe UI"/>
+          <w:b/>
+          <w:bCs/>
+          <w:color w:val="F8FAFF"/>
+          <w:kern w:val="0"/>
+          <w:sz w:val="27"/>
+          <w:szCs w:val="27"/>
+          <w:lang w:eastAsia="en-GB"/>
+          <w14:ligatures w14:val="none"/>
+        </w:rPr>
+        <w:t>To confirm my understanding of the workflow:</w:t>
+      </w:r>
+    </w:p>
+    <w:p>
+      <w:pPr>
+        <w:shd w:val="clear" w:color="auto" w:fill="292A2D"/>
+        <w:spacing w:after="206" w:line="240" w:lineRule="auto"/>
+        <w:outlineLvl w:val="2"/>
+        <w:rPr>
+          <w:rFonts w:ascii="Segoe UI" w:eastAsia="Times New Roman" w:hAnsi="Segoe UI" w:cs="Segoe UI"/>
+          <w:b/>
+          <w:bCs/>
+          <w:color w:val="F8FAFF"/>
+          <w:kern w:val="0"/>
+          <w:sz w:val="27"/>
+          <w:szCs w:val="27"/>
+          <w:lang w:eastAsia="en-GB"/>
+          <w14:ligatures w14:val="none"/>
+        </w:rPr>
+      </w:pPr>
+      <w:r>
+        <w:rPr>
+          <w:rFonts w:ascii="Segoe UI" w:eastAsia="Times New Roman" w:hAnsi="Segoe UI" w:cs="Segoe UI"/>
+          <w:b/>
+          <w:bCs/>
+          <w:color w:val="F8FAFF"/>
+          <w:kern w:val="0"/>
+          <w:sz w:val="27"/>
+          <w:szCs w:val="27"/>
+          <w:lang w:eastAsia="en-GB"/>
+          <w14:ligatures w14:val="none"/>
+        </w:rPr>
+        <w:t xml:space="preserve">A </w:t>
+      </w:r>
+      <w:proofErr w:type="spellStart"/>
+      <w:r>
+        <w:rPr>
+          <w:rFonts w:ascii="Segoe UI" w:eastAsia="Times New Roman" w:hAnsi="Segoe UI" w:cs="Segoe UI"/>
+          <w:b/>
+          <w:bCs/>
+          <w:color w:val="F8FAFF"/>
+          <w:kern w:val="0"/>
+          <w:sz w:val="27"/>
+          <w:szCs w:val="27"/>
+          <w:lang w:eastAsia="en-GB"/>
+          <w14:ligatures w14:val="none"/>
+        </w:rPr>
+        <w:t>BonusInstance</w:t>
+      </w:r>
+      <w:proofErr w:type="spellEnd"/>
+      <w:r>
+        <w:rPr>
+          <w:rFonts w:ascii="Segoe UI" w:eastAsia="Times New Roman" w:hAnsi="Segoe UI" w:cs="Segoe UI"/>
+          <w:b/>
+          <w:bCs/>
+          <w:color w:val="F8FAFF"/>
+          <w:kern w:val="0"/>
+          <w:sz w:val="27"/>
+          <w:szCs w:val="27"/>
+          <w:lang w:eastAsia="en-GB"/>
+          <w14:ligatures w14:val="none"/>
+        </w:rPr>
+        <w:t xml:space="preserve"> is created for a specific period (e.g., Q2 2025)</w:t>
+      </w:r>
+    </w:p>
+    <w:p>
+      <w:pPr>
+        <w:shd w:val="clear" w:color="auto" w:fill="292A2D"/>
+        <w:spacing w:after="206" w:line="240" w:lineRule="auto"/>
+        <w:outlineLvl w:val="2"/>
+        <w:rPr>
+          <w:rFonts w:ascii="Segoe UI" w:eastAsia="Times New Roman" w:hAnsi="Segoe UI" w:cs="Segoe UI"/>
+          <w:b/>
+          <w:bCs/>
+          <w:color w:val="F8FAFF"/>
+          <w:kern w:val="0"/>
+          <w:sz w:val="27"/>
+          <w:szCs w:val="27"/>
+          <w:lang w:eastAsia="en-GB"/>
+          <w14:ligatures w14:val="none"/>
+        </w:rPr>
+      </w:pPr>
+      <w:r>
+        <w:rPr>
+          <w:rFonts w:ascii="Segoe UI" w:eastAsia="Times New Roman" w:hAnsi="Segoe UI" w:cs="Segoe UI"/>
+          <w:b/>
+          <w:bCs/>
+          <w:color w:val="F8FAFF"/>
+          <w:kern w:val="0"/>
+          <w:sz w:val="27"/>
+          <w:szCs w:val="27"/>
+          <w:lang w:eastAsia="en-GB"/>
+          <w14:ligatures w14:val="none"/>
+        </w:rPr>
+        <w:t>The system immediately takes a snapshot of all personnel's current state</w:t>
+      </w:r>
+    </w:p>
+    <w:p>
+      <w:pPr>
+        <w:shd w:val="clear" w:color="auto" w:fill="292A2D"/>
+        <w:spacing w:after="206" w:line="240" w:lineRule="auto"/>
+        <w:outlineLvl w:val="2"/>
+        <w:rPr>
+          <w:rFonts w:ascii="Segoe UI" w:eastAsia="Times New Roman" w:hAnsi="Segoe UI" w:cs="Segoe UI"/>
+          <w:b/>
+          <w:bCs/>
+          <w:color w:val="F8FAFF"/>
+          <w:kern w:val="0"/>
+          <w:sz w:val="27"/>
+          <w:szCs w:val="27"/>
+          <w:lang w:eastAsia="en-GB"/>
+          <w14:ligatures w14:val="none"/>
+        </w:rPr>
+      </w:pPr>
+      <w:r>
+        <w:rPr>
+          <w:rFonts w:ascii="Segoe UI" w:eastAsia="Times New Roman" w:hAnsi="Segoe UI" w:cs="Segoe UI"/>
+          <w:b/>
+          <w:bCs/>
+          <w:color w:val="F8FAFF"/>
+          <w:kern w:val="0"/>
+          <w:sz w:val="27"/>
+          <w:szCs w:val="27"/>
+          <w:lang w:eastAsia="en-GB"/>
+          <w14:ligatures w14:val="none"/>
+        </w:rPr>
+        <w:t>Allocations are calculated based on these snapshots</w:t>
+      </w:r>
+    </w:p>
+    <w:p>
+      <w:pPr>
+        <w:shd w:val="clear" w:color="auto" w:fill="292A2D"/>
+        <w:spacing w:after="206" w:line="240" w:lineRule="auto"/>
+        <w:outlineLvl w:val="2"/>
+        <w:rPr>
+          <w:rFonts w:ascii="Segoe UI" w:eastAsia="Times New Roman" w:hAnsi="Segoe UI" w:cs="Segoe UI"/>
+          <w:b/>
+          <w:bCs/>
+          <w:color w:val="F8FAFF"/>
+          <w:kern w:val="0"/>
+          <w:sz w:val="27"/>
+          <w:szCs w:val="27"/>
+          <w:lang w:eastAsia="en-GB"/>
+          <w14:ligatures w14:val="none"/>
+        </w:rPr>
+      </w:pPr>
+      <w:r>
+        <w:rPr>
+          <w:rFonts w:ascii="Segoe UI" w:eastAsia="Times New Roman" w:hAnsi="Segoe UI" w:cs="Segoe UI"/>
+          <w:b/>
+          <w:bCs/>
+          <w:color w:val="F8FAFF"/>
+          <w:kern w:val="0"/>
+          <w:sz w:val="27"/>
+          <w:szCs w:val="27"/>
+          <w:lang w:eastAsia="en-GB"/>
+          <w14:ligatures w14:val="none"/>
+        </w:rPr>
+        <w:t>Users can review and adjust these allocations (modifying parts, which recalculates amounts)</w:t>
+      </w:r>
+    </w:p>
+    <w:p>
+      <w:pPr>
+        <w:shd w:val="clear" w:color="auto" w:fill="292A2D"/>
+        <w:spacing w:after="206" w:line="240" w:lineRule="auto"/>
+        <w:outlineLvl w:val="2"/>
+        <w:rPr>
+          <w:rFonts w:ascii="Segoe UI" w:eastAsia="Times New Roman" w:hAnsi="Segoe UI" w:cs="Segoe UI"/>
+          <w:b/>
+          <w:bCs/>
+          <w:color w:val="F8FAFF"/>
+          <w:kern w:val="0"/>
+          <w:sz w:val="27"/>
+          <w:szCs w:val="27"/>
+          <w:lang w:eastAsia="en-GB"/>
+          <w14:ligatures w14:val="none"/>
+        </w:rPr>
+      </w:pPr>
+      <w:r>
+        <w:rPr>
+          <w:rFonts w:ascii="Segoe UI" w:eastAsia="Times New Roman" w:hAnsi="Segoe UI" w:cs="Segoe UI"/>
+          <w:b/>
+          <w:bCs/>
+          <w:color w:val="F8FAFF"/>
+          <w:kern w:val="0"/>
+          <w:sz w:val="27"/>
+          <w:szCs w:val="27"/>
+          <w:lang w:eastAsia="en-GB"/>
+          <w14:ligatures w14:val="none"/>
+        </w:rPr>
+        <w:t>These adjustments don't change the snapshot data but only how that data is interpreted for allocation purposes</w:t>
+      </w:r>
+    </w:p>
+    <w:p>
+      <w:pPr>
+        <w:shd w:val="clear" w:color="auto" w:fill="292A2D"/>
+        <w:spacing w:after="206" w:line="240" w:lineRule="auto"/>
+        <w:outlineLvl w:val="2"/>
+        <w:rPr>
+          <w:rFonts w:ascii="Segoe UI" w:eastAsia="Times New Roman" w:hAnsi="Segoe UI" w:cs="Segoe UI"/>
+          <w:b/>
+          <w:bCs/>
+          <w:color w:val="F8FAFF"/>
+          <w:kern w:val="0"/>
+          <w:sz w:val="27"/>
+          <w:szCs w:val="27"/>
+          <w:lang w:eastAsia="en-GB"/>
+          <w14:ligatures w14:val="none"/>
+        </w:rPr>
+      </w:pPr>
+      <w:r>
+        <w:rPr>
+          <w:rFonts w:ascii="Segoe UI" w:eastAsia="Times New Roman" w:hAnsi="Segoe UI" w:cs="Segoe UI"/>
+          <w:b/>
+          <w:bCs/>
+          <w:color w:val="F8FAFF"/>
+          <w:kern w:val="0"/>
+          <w:sz w:val="27"/>
+          <w:szCs w:val="27"/>
+          <w:lang w:eastAsia="en-GB"/>
+          <w14:ligatures w14:val="none"/>
+        </w:rPr>
+        <w:t>Once approved, the instance and its allocations are locked, preserving the historical record</w:t>
+      </w:r>
+    </w:p>
+    <w:p>
+      <w:pPr>
+        <w:shd w:val="clear" w:color="auto" w:fill="292A2D"/>
+        <w:spacing w:after="206" w:line="240" w:lineRule="auto"/>
+        <w:outlineLvl w:val="2"/>
+        <w:rPr>
+          <w:rFonts w:ascii="Segoe UI" w:eastAsia="Times New Roman" w:hAnsi="Segoe UI" w:cs="Segoe UI"/>
+          <w:b/>
+          <w:bCs/>
+          <w:color w:val="F8FAFF"/>
+          <w:kern w:val="0"/>
+          <w:sz w:val="27"/>
+          <w:szCs w:val="27"/>
+          <w:lang w:eastAsia="en-GB"/>
+          <w14:ligatures w14:val="none"/>
+        </w:rPr>
+      </w:pPr>
+      <w:r>
+        <w:rPr>
+          <w:rFonts w:ascii="Segoe UI" w:eastAsia="Times New Roman" w:hAnsi="Segoe UI" w:cs="Segoe UI"/>
+          <w:b/>
+          <w:bCs/>
+          <w:color w:val="F8FAFF"/>
+          <w:kern w:val="0"/>
+          <w:sz w:val="27"/>
+          <w:szCs w:val="27"/>
+          <w:lang w:eastAsia="en-GB"/>
+          <w14:ligatures w14:val="none"/>
+        </w:rPr>
+        <w:t>This design ensures that bonus calculations are always based on consistent, point-in-time data, and that historical bonus records remain accurate even as personnel data changes over time.</w:t>
+      </w:r>
+    </w:p>
+    <w:p>
+      <w:pPr>
+        <w:shd w:val="clear" w:color="auto" w:fill="292A2D"/>
+        <w:spacing w:after="206" w:line="240" w:lineRule="auto"/>
+        <w:outlineLvl w:val="2"/>
+        <w:rPr>
+          <w:rFonts w:ascii="Segoe UI" w:eastAsia="Times New Roman" w:hAnsi="Segoe UI" w:cs="Segoe UI"/>
+          <w:b/>
+          <w:bCs/>
+          <w:color w:val="F8FAFF"/>
+          <w:kern w:val="0"/>
+          <w:sz w:val="27"/>
+          <w:szCs w:val="27"/>
+          <w:lang w:eastAsia="en-GB"/>
+          <w14:ligatures w14:val="none"/>
+        </w:rPr>
+      </w:pPr>
+    </w:p>
+    <w:p>
+      <w:pPr>
+        <w:shd w:val="clear" w:color="auto" w:fill="292A2D"/>
+        <w:spacing w:after="206" w:line="240" w:lineRule="auto"/>
+        <w:outlineLvl w:val="2"/>
+        <w:rPr>
+          <w:rFonts w:ascii="Segoe UI" w:eastAsia="Times New Roman" w:hAnsi="Segoe UI" w:cs="Segoe UI"/>
+          <w:b/>
+          <w:bCs/>
+          <w:color w:val="F8FAFF"/>
+          <w:kern w:val="0"/>
+          <w:sz w:val="27"/>
+          <w:szCs w:val="27"/>
+          <w:lang w:eastAsia="en-GB"/>
+          <w14:ligatures w14:val="none"/>
+        </w:rPr>
+      </w:pPr>
+      <w:r>
+        <w:rPr>
+          <w:rFonts w:ascii="Segoe UI" w:eastAsia="Times New Roman" w:hAnsi="Segoe UI" w:cs="Segoe UI"/>
+          <w:b/>
+          <w:bCs/>
+          <w:color w:val="F8FAFF"/>
+          <w:kern w:val="0"/>
+          <w:sz w:val="27"/>
+          <w:szCs w:val="27"/>
+          <w:lang w:eastAsia="en-GB"/>
+          <w14:ligatures w14:val="none"/>
+        </w:rPr>
+        <w:t>---------END QUESTIONS---</w:t>
+      </w:r>
+    </w:p>
+    <w:p>
+      <w:pPr>
+        <w:shd w:val="clear" w:color="auto" w:fill="292A2D"/>
+        <w:spacing w:after="206" w:line="240" w:lineRule="auto"/>
+        <w:outlineLvl w:val="2"/>
+        <w:rPr>
+          <w:rFonts w:ascii="Segoe UI" w:eastAsia="Times New Roman" w:hAnsi="Segoe UI" w:cs="Segoe UI"/>
           <w:color w:val="F8FAFF"/>
           <w:kern w:val="0"/>
           <w:sz w:val="27"/>
@@ -55,6 +1817,7 @@
           <w:lang w:eastAsia="en-GB"/>
           <w14:ligatures w14:val="none"/>
         </w:rPr>
+        <w:lastRenderedPageBreak/>
         <w:t>1. Automatic Generation (Cron Jobs)</w:t>
       </w:r>
     </w:p>
@@ -906,7 +2669,6 @@
           <w:kern w:val="0"/>
           <w:lang w:eastAsia="en-GB"/>
         </w:rPr>
-        <w:lastRenderedPageBreak/>
         <w:pict w14:anchorId="1E1A6018">
           <v:rect id="_x0000_i1034" alt="" style="width:451.3pt;height:.05pt;mso-width-percent:0;mso-height-percent:0;mso-width-percent:0;mso-height-percent:0" o:hralign="center" o:hrstd="t" o:hrnoshade="t" o:hr="t" fillcolor="#f8faff" stroked="f"/>
         </w:pict>
@@ -939,6 +2701,7 @@
           <w:lang w:eastAsia="en-GB"/>
           <w14:ligatures w14:val="none"/>
         </w:rPr>
+        <w:lastRenderedPageBreak/>
         <w:t>Next Steps for UX Design</w:t>
       </w:r>
     </w:p>
@@ -1179,7 +2942,7 @@
           <w:szCs w:val="27"/>
           <w:shd w:val="clear" w:color="auto" w:fill="383739"/>
         </w:rPr>
-        <w:t xml:space="preserve">I want you to help me design a Bonus Management System module that integrates with my existing MEAN stack project. This playbook outlines the requirements and specifications for this integration. OBJECTIVE: Create a comprehensive Bonus Management System that seamlessly integrates with my existing MEAN stack application, allowing for the creation, management, calculation, approval, and reporting of employee bonuses. SYSTEM ARCHITECTURE: 1. Backend Components (Node.js/Express) - Create a modular structure for the bonus management system - Implement RESTful API endpoints for all bonus operations - Develop the core bonus calculation engine (bonusgeneration.js) - Build eligibility determination system for filtering personnel - Implement retroactive adjustment mechanism for handling changes - Create approval workflow engine with configurable state transitions - Develop reporting and analytics engine for insights 2. Database Schema (MongoDB) - Design and implement the following collections: a. Bonus Templates: Store reusable bonus plans and calculation rules b. Bonus Instances: Track individual bonus generation events c. Personnel Snapshots: Capture employee data at specific points in time - Ensure proper indexing for performance optimization - Implement data validation rules 3. Frontend Components (Angular) - Create intuitive UI components for all bonus management functions - Implement responsive design for all screen sizes - Build role-based access control for different user types - Develop interactive </w:t>
+        <w:t xml:space="preserve">I want you to help me design a Bonus Management System module that integrates with my existing MEAN stack project. This playbook outlines the requirements and specifications for this integration. OBJECTIVE: Create a comprehensive Bonus Management System that seamlessly integrates with my existing MEAN stack application, allowing for the creation, management, calculation, approval, and reporting of employee bonuses. SYSTEM ARCHITECTURE: 1. Backend Components (Node.js/Express) - Create a modular structure for the bonus management system - Implement RESTful API endpoints for all bonus operations - Develop the core bonus calculation engine (bonusgeneration.js) - Build eligibility determination system for filtering personnel - Implement retroactive adjustment mechanism for handling changes - Create approval workflow engine with configurable state transitions - Develop reporting and analytics engine for insights 2. Database Schema (MongoDB) - Design and implement the following collections: a. Bonus Templates: Store reusable bonus plans and calculation rules b. Bonus Instances: Track individual bonus generation events c. Personnel Snapshots: Capture employee data at specific points in time - Ensure proper indexing for performance optimization - Implement data validation rules 3. Frontend Components (Angular) - Create intuitive UI components for all bonus management functions - Implement responsive design for all screen sizes - Build role-based access control for different user types - Develop interactive dashboards and reporting interfaces CORE FEATURES: 1. Bonus Templates - </w:t>
       </w:r>
       <w:r>
         <w:rPr>
@@ -1190,7 +2953,7 @@
           <w:shd w:val="clear" w:color="auto" w:fill="383739"/>
         </w:rPr>
         <w:lastRenderedPageBreak/>
-        <w:t xml:space="preserve">dashboards and reporting interfaces CORE FEATURES: 1. Bonus Templates - Support multiple calculation methodologies: * Fixed Amount: Simple flat-rate bonuses * Percentage-Based: Calculated as a percentage of base salary * Parts-Based: Complex calculations with weighted components * Formula-Based: Custom mathematical formulas with variable substitution - Template activation/deactivation functionality - Eligibility criteria configuration 2. Personnel Management - Integration with existing personnel data - Point-in-time snapshots for historical accuracy - Custom attribute support for bonus-specific data 3. Bonus Generation - Manual and scheduled automatic generation - Period-based generation (monthly, quarterly, yearly) - Bulk and individual bonus creation 4. Approval Workflow - Multi-step approval process with role-based permissions - State transitions: draft → generated → </w:t>
+        <w:t xml:space="preserve">Support multiple calculation methodologies: * Fixed Amount: Simple flat-rate bonuses * Percentage-Based: Calculated as a percentage of base salary * Parts-Based: Complex calculations with weighted components * Formula-Based: Custom mathematical formulas with variable substitution - Template activation/deactivation functionality - Eligibility criteria configuration 2. Personnel Management - Integration with existing personnel data - Point-in-time snapshots for historical accuracy - Custom attribute support for bonus-specific data 3. Bonus Generation - Manual and scheduled automatic generation - Period-based generation (monthly, quarterly, yearly) - Bulk and individual bonus creation 4. Approval Workflow - Multi-step approval process with role-based permissions - State transitions: draft → generated → </w:t>
       </w:r>
       <w:proofErr w:type="spellStart"/>
       <w:r>
@@ -1212,7 +2975,7 @@
           <w:szCs w:val="27"/>
           <w:shd w:val="clear" w:color="auto" w:fill="383739"/>
         </w:rPr>
-        <w:t xml:space="preserve"> → approved → paid - Complete audit trail of all workflow changes - Comments and annotations at each approval step 5. Reporting and Analytics - Summary and detailed bonus reports - Filtering and grouping options - Export capabilities (Excel, PDF, CSV) - Historical trend analysis TECHNICAL SPECIFICATIONS: 1. Backend Implementation - Use Node.js with Express framework - Implement service-oriented architecture - Ensure proper error handling and validation - Optimize for performance with batch processing and caching - Implement comprehensive logging 2. Database Design - Use MongoDB with Mongoose ODM - Design flexible document schemas - Implement proper indexing strategy - Ensure data integrity with validation 3. Frontend Implementation - Use Angular with TypeScript - Implement reactive forms with validation - Create reusable UI components - Ensure responsive design with CSS frameworks - Implement proper state management 4. Security Considerations - Role-based access control - Input validation and sanitization - Audit logging for sensitive operations - Data encryption for sensitive fields INTEGRATION POINTS: 1. User Authentication and Authorization - Leverage existing authentication system - Extend role-based permissions for bonus management 2. Personnel Data - Connect to existing employee database - Implement data synchronization mechanism 3. Notification System - Integrate with existing notification framework - Add bonus-specific notification templates 4. </w:t>
+        <w:t xml:space="preserve"> → approved → paid - Complete audit trail of all workflow changes - Comments and annotations at each approval step 5. Reporting and Analytics - Summary and detailed bonus reports - Filtering and grouping options - Export capabilities (Excel, PDF, CSV) - Historical trend analysis TECHNICAL SPECIFICATIONS: 1. Backend Implementation - Use Node.js with Express framework - Implement service-oriented architecture - Ensure proper error handling and validation - Optimize for performance with batch processing and caching - Implement comprehensive logging 2. Database Design - Use MongoDB with Mongoose ODM - Design flexible document schemas - Implement proper indexing strategy - Ensure data integrity with validation 3. Frontend Implementation - Use Angular with TypeScript - Implement reactive forms with validation - Create reusable UI components - Ensure responsive design with CSS frameworks - Implement proper state management 4. Security Considerations - Role-based access control - Input validation and sanitization - Audit logging for sensitive operations - Data encryption for sensitive fields INTEGRATION POINTS: 1. User Authentication and Authorization - Leverage existing authentication system - Extend role-based permissions for bonus management 2. Personnel Data - Connect to existing employee database - Implement data synchronization mechanism 3. Notification System - Integrate with existing notification framework - Add bonus-specific notification templates 4. Financial Systems - Define integration points with payroll systems - </w:t>
       </w:r>
       <w:r>
         <w:rPr>
@@ -1223,7 +2986,7 @@
           <w:shd w:val="clear" w:color="auto" w:fill="383739"/>
         </w:rPr>
         <w:lastRenderedPageBreak/>
-        <w:t>Financial Systems - Define integration points with payroll systems - Implement export functionality for financial data IMPLEMENTATION APPROACH: 1. Phase 1: Core Backend Development - Implement database schemas - Develop bonus calculation engine - Create basic API endpoints 2. Phase 2: Frontend Development - Build UI components - Implement forms and validation - Create dashboard views 3. Phase 3: Workflow and Reporting - Implement approval workflow - Develop reporting functionality - Add export capabilities 4. Phase 4: Integration and Testing - Connect with existing systems - Perform comprehensive testing - Optimize performance TESTING STRATEGY: 1. Unit Testing - Test individual components and functions - Focus on calculation accuracy and edge cases 2. Integration Testing - Test API endpoints and database operations - Verify workflow transitions 3. User Acceptance Testing - Validate against business requirements - Ensure usability and performance DEPLOYMENT CONSIDERATIONS: 1. Database Migration - Plan for schema updates - Implement data migration scripts 2. Feature Flagging - Use feature flags for gradual rollout - Enable A/B testing of new features 3. Performance Monitoring - Implement metrics collection - Set up alerting for performance issues SUCCESS CRITERIA: 1. The Bonus Management System successfully integrates with the existing MEAN stack application 2. All bonus calculations are accurate and consistent 3. The approval workflow functions correctly with proper role-based permissions 4. Reports provide meaningful insights and export correctly 5. The system performs efficiently with large datasets 6. User interface is intuitive and responsive This playbook provides a comprehensive framework for implementing a Bonus Management System within your existing MEAN stack project. The modular approach allows for phased implementation and testing, ensuring a successful integration.</w:t>
+        <w:t>Implement export functionality for financial data IMPLEMENTATION APPROACH: 1. Phase 1: Core Backend Development - Implement database schemas - Develop bonus calculation engine - Create basic API endpoints 2. Phase 2: Frontend Development - Build UI components - Implement forms and validation - Create dashboard views 3. Phase 3: Workflow and Reporting - Implement approval workflow - Develop reporting functionality - Add export capabilities 4. Phase 4: Integration and Testing - Connect with existing systems - Perform comprehensive testing - Optimize performance TESTING STRATEGY: 1. Unit Testing - Test individual components and functions - Focus on calculation accuracy and edge cases 2. Integration Testing - Test API endpoints and database operations - Verify workflow transitions 3. User Acceptance Testing - Validate against business requirements - Ensure usability and performance DEPLOYMENT CONSIDERATIONS: 1. Database Migration - Plan for schema updates - Implement data migration scripts 2. Feature Flagging - Use feature flags for gradual rollout - Enable A/B testing of new features 3. Performance Monitoring - Implement metrics collection - Set up alerting for performance issues SUCCESS CRITERIA: 1. The Bonus Management System successfully integrates with the existing MEAN stack application 2. All bonus calculations are accurate and consistent 3. The approval workflow functions correctly with proper role-based permissions 4. Reports provide meaningful insights and export correctly 5. The system performs efficiently with large datasets 6. User interface is intuitive and responsive This playbook provides a comprehensive framework for implementing a Bonus Management System within your existing MEAN stack project. The modular approach allows for phased implementation and testing, ensuring a successful integration.</w:t>
       </w:r>
       <w:r>
         <w:rPr>

</xml_diff>